<commit_message>
Learn JS Day 2
</commit_message>
<xml_diff>
--- a/LyThuyetJS/LyThuyetJS.docx
+++ b/LyThuyetJS/LyThuyetJS.docx
@@ -234,7 +234,27 @@
           <w:sz w:val="28"/>
           <w:szCs w:val="28"/>
         </w:rPr>
-        <w:t>const dùng cho biến không thay đổi tham chiếu.</w:t>
+        <w:t xml:space="preserve">const dùng cho biến không thay đổi </w:t>
+      </w:r>
+      <w:r>
+        <w:rPr>
+          <w:rFonts w:ascii="Arial" w:eastAsia="Times New Roman" w:hAnsi="Arial" w:cs="Arial"/>
+          <w:bCs/>
+          <w:sz w:val="28"/>
+          <w:szCs w:val="28"/>
+        </w:rPr>
+        <w:t>giá trị nữa</w:t>
+      </w:r>
+      <w:bookmarkStart w:id="0" w:name="_GoBack"/>
+      <w:bookmarkEnd w:id="0"/>
+      <w:r>
+        <w:rPr>
+          <w:rFonts w:ascii="Arial" w:eastAsia="Times New Roman" w:hAnsi="Arial" w:cs="Arial"/>
+          <w:bCs/>
+          <w:sz w:val="28"/>
+          <w:szCs w:val="28"/>
+        </w:rPr>
+        <w:t>.</w:t>
       </w:r>
     </w:p>
     <w:p>
@@ -730,16 +750,7 @@
           <w:sz w:val="28"/>
           <w:szCs w:val="28"/>
         </w:rPr>
-        <w:t xml:space="preserve">2. </w:t>
-      </w:r>
-      <w:r>
-        <w:rPr>
-          <w:rFonts w:ascii="Arial" w:hAnsi="Arial" w:cs="Arial"/>
-          <w:b/>
-          <w:sz w:val="28"/>
-          <w:szCs w:val="28"/>
-        </w:rPr>
-        <w:t>Objects: The Basics</w:t>
+        <w:t>2. Objects: The Basics</w:t>
       </w:r>
     </w:p>
     <w:p>
@@ -1405,8 +1416,6 @@
         </w:rPr>
         <w:t>let obj = {</w:t>
       </w:r>
-      <w:bookmarkStart w:id="0" w:name="_GoBack"/>
-      <w:bookmarkEnd w:id="0"/>
     </w:p>
     <w:p>
       <w:pPr>

</xml_diff>